<commit_message>
Harden model pipeline and betting controls
</commit_message>
<xml_diff>
--- a/docs/MLB_Model_V2_Priority_Recommendations.docx
+++ b/docs/MLB_Model_V2_Priority_Recommendations.docx
@@ -29,7 +29,7 @@
         <w:pStyle w:val="AuditSubtitle"/>
       </w:pPr>
       <w:r>
-        <w:t>Read-only review follow-up | Prepared July 31, 2026</w:t>
+        <w:t>Audit Subtitle: Implementation follow-up | Updated August 19, 2026</w:t>
       </w:r>
     </w:p>
     <w:p>
@@ -37,57 +37,11 @@
         <w:spacing w:after="200"/>
       </w:pPr>
       <w:r>
-        <w:rPr>
-          <w:rFonts w:ascii="Calibri" w:hAnsi="Calibri" w:eastAsia="Calibri"/>
-          <w:b/>
-          <w:color w:val="1F4D78"/>
-          <w:sz w:val="19"/>
-        </w:rPr>
-        <w:t xml:space="preserve">Purpose: </w:t>
-      </w:r>
-      <w:r>
-        <w:rPr>
-          <w:rFonts w:ascii="Calibri" w:hAnsi="Calibri" w:eastAsia="Calibri"/>
-          <w:color w:val="5B6573"/>
-          <w:sz w:val="19"/>
-        </w:rPr>
-        <w:t>Turn the audit into copy-ready implementation notes</w:t>
+        <w:t>Purpose: Turn the audit into copy-ready implementation notes</w:t>
         <w:br/>
-      </w:r>
-      <w:r>
-        <w:rPr>
-          <w:rFonts w:ascii="Calibri" w:hAnsi="Calibri" w:eastAsia="Calibri"/>
-          <w:b/>
-          <w:color w:val="1F4D78"/>
-          <w:sz w:val="19"/>
-        </w:rPr>
-        <w:t xml:space="preserve">Scope: </w:t>
-      </w:r>
-      <w:r>
-        <w:rPr>
-          <w:rFonts w:ascii="Calibri" w:hAnsi="Calibri" w:eastAsia="Calibri"/>
-          <w:color w:val="5B6573"/>
-          <w:sz w:val="19"/>
-        </w:rPr>
-        <w:t>Moneyline model, data pipeline, automation, bankroll tracking, and props</w:t>
+        <w:t>Scope: Moneyline model, data pipeline, automation, bankroll tracking, and props</w:t>
         <w:br/>
-      </w:r>
-      <w:r>
-        <w:rPr>
-          <w:rFonts w:ascii="Calibri" w:hAnsi="Calibri" w:eastAsia="Calibri"/>
-          <w:b/>
-          <w:color w:val="1F4D78"/>
-          <w:sz w:val="19"/>
-        </w:rPr>
-        <w:t xml:space="preserve">Change status: </w:t>
-      </w:r>
-      <w:r>
-        <w:rPr>
-          <w:rFonts w:ascii="Calibri" w:hAnsi="Calibri" w:eastAsia="Calibri"/>
-          <w:color w:val="5B6573"/>
-          <w:sz w:val="19"/>
-        </w:rPr>
-        <w:t>Recommendations only; no model or source-code changes included</w:t>
+        <w:t>Change status: Recommendations retained as the baseline; implementation results appended</w:t>
       </w:r>
     </w:p>
     <w:p>
@@ -100,21 +54,7 @@
         </w:pBdr>
       </w:pPr>
       <w:r>
-        <w:rPr>
-          <w:rFonts w:ascii="Calibri" w:hAnsi="Calibri" w:eastAsia="Calibri"/>
-          <w:b/>
-          <w:color w:val="0B2545"/>
-          <w:sz w:val="23"/>
-        </w:rPr>
-        <w:t xml:space="preserve">Bottom line: </w:t>
-      </w:r>
-      <w:r>
-        <w:rPr>
-          <w:rFonts w:ascii="Calibri" w:hAnsi="Calibri" w:eastAsia="Calibri"/>
-          <w:color w:val="1F2933"/>
-          <w:sz w:val="23"/>
-        </w:rPr>
-        <w:t>The project is a strong modeling prototype with healthy raw data and measurable predictive signal. It is not yet a decision-grade betting system because the historical evaluation contains temporal leakage, the ROI backtest does not use actual executable prices, and the live automation can miss or mis-log betting windows.</w:t>
+        <w:t>Original audit bottom line (superseded by the implementation update at the end): The project was a strong modeling prototype, but was not yet a decision-grade betting system.</w:t>
       </w:r>
     </w:p>
     <w:p>
@@ -2874,11 +2814,790 @@
         <w:t>When changes begin, use a separate worktree such as codex/model-audit-fixes. Keep the production checkout on its current branch until the revised pipeline, artifacts, and scheduler behavior pass shadow-mode verification.</w:t>
       </w:r>
     </w:p>
+    <w:p>
+      <w:r>
+        <w:br w:type="page"/>
+      </w:r>
+    </w:p>
+    <w:p>
+      <w:pPr>
+        <w:pStyle w:val="Heading1"/>
+      </w:pPr>
+      <w:r>
+        <w:t>Implementation update - August 19, 2026</w:t>
+      </w:r>
+    </w:p>
+    <w:p>
+      <w:r>
+        <w:rPr>
+          <w:b/>
+        </w:rPr>
+        <w:t xml:space="preserve">Current verdict: </w:t>
+      </w:r>
+      <w:r>
+        <w:t>The system is materially safer, reproducible, and operationally testable. It is still not proven profitable. The production real-price result is promising but remains below the required sample size and its uncertainty interval includes zero, so strategy_validated remains false.</w:t>
+      </w:r>
+    </w:p>
+    <w:p>
+      <w:pPr>
+        <w:pStyle w:val="Heading2"/>
+      </w:pPr>
+      <w:r>
+        <w:t>Priority status</w:t>
+      </w:r>
+    </w:p>
+    <w:tbl>
+      <w:tblPr>
+        <w:tblStyle w:val="TableGrid"/>
+        <w:tblW w:type="dxa" w:w="9360"/>
+        <w:jc w:val="left"/>
+        <w:tblLayout w:type="fixed"/>
+        <w:tblLook w:firstColumn="1" w:firstRow="1" w:lastColumn="0" w:lastRow="0" w:noHBand="0" w:noVBand="1" w:val="04A0"/>
+        <w:tblInd w:type="dxa" w:w="120"/>
+      </w:tblPr>
+      <w:tblGrid>
+        <w:gridCol w:w="2088"/>
+        <w:gridCol w:w="1656"/>
+        <w:gridCol w:w="5616"/>
+      </w:tblGrid>
+      <w:tr>
+        <w:trPr>
+          <w:tblHeader w:val="true"/>
+        </w:trPr>
+        <w:tc>
+          <w:tcPr>
+            <w:tcW w:type="dxa" w:w="2088"/>
+            <w:vAlign w:val="center"/>
+            <w:shd w:fill="244A6B"/>
+            <w:tcMar>
+              <w:top w:w="80" w:type="dxa"/>
+              <w:bottom w:w="80" w:type="dxa"/>
+              <w:start w:w="120" w:type="dxa"/>
+              <w:end w:w="120" w:type="dxa"/>
+            </w:tcMar>
+          </w:tcPr>
+          <w:p>
+            <w:r>
+              <w:rPr>
+                <w:b/>
+                <w:color w:val="FFFFFF"/>
+              </w:rPr>
+              <w:t>Area</w:t>
+            </w:r>
+          </w:p>
+        </w:tc>
+        <w:tc>
+          <w:tcPr>
+            <w:tcW w:type="dxa" w:w="1656"/>
+            <w:vAlign w:val="center"/>
+            <w:shd w:fill="244A6B"/>
+            <w:tcMar>
+              <w:top w:w="80" w:type="dxa"/>
+              <w:bottom w:w="80" w:type="dxa"/>
+              <w:start w:w="120" w:type="dxa"/>
+              <w:end w:w="120" w:type="dxa"/>
+            </w:tcMar>
+          </w:tcPr>
+          <w:p>
+            <w:r>
+              <w:rPr>
+                <w:b/>
+                <w:color w:val="FFFFFF"/>
+              </w:rPr>
+              <w:t>Status</w:t>
+            </w:r>
+          </w:p>
+        </w:tc>
+        <w:tc>
+          <w:tcPr>
+            <w:tcW w:type="dxa" w:w="5616"/>
+            <w:vAlign w:val="center"/>
+            <w:shd w:fill="244A6B"/>
+            <w:tcMar>
+              <w:top w:w="80" w:type="dxa"/>
+              <w:bottom w:w="80" w:type="dxa"/>
+              <w:start w:w="120" w:type="dxa"/>
+              <w:end w:w="120" w:type="dxa"/>
+            </w:tcMar>
+          </w:tcPr>
+          <w:p>
+            <w:r>
+              <w:rPr>
+                <w:b/>
+                <w:color w:val="FFFFFF"/>
+              </w:rPr>
+              <w:t>Implementation result</w:t>
+            </w:r>
+          </w:p>
+        </w:tc>
+      </w:tr>
+      <w:tr>
+        <w:trPr/>
+        <w:tc>
+          <w:tcPr>
+            <w:tcW w:type="dxa" w:w="2088"/>
+            <w:vAlign w:val="top"/>
+            <w:tcMar>
+              <w:top w:w="80" w:type="dxa"/>
+              <w:bottom w:w="80" w:type="dxa"/>
+              <w:start w:w="120" w:type="dxa"/>
+              <w:end w:w="120" w:type="dxa"/>
+            </w:tcMar>
+          </w:tcPr>
+          <w:p>
+            <w:pPr>
+              <w:spacing w:after="40"/>
+            </w:pPr>
+            <w:r>
+              <w:t>Temporal integrity</w:t>
+            </w:r>
+          </w:p>
+        </w:tc>
+        <w:tc>
+          <w:tcPr>
+            <w:tcW w:type="dxa" w:w="1656"/>
+            <w:vAlign w:val="top"/>
+            <w:tcMar>
+              <w:top w:w="80" w:type="dxa"/>
+              <w:bottom w:w="80" w:type="dxa"/>
+              <w:start w:w="120" w:type="dxa"/>
+              <w:end w:w="120" w:type="dxa"/>
+            </w:tcMar>
+          </w:tcPr>
+          <w:p>
+            <w:pPr>
+              <w:spacing w:after="40"/>
+            </w:pPr>
+            <w:r>
+              <w:t>Implemented</w:t>
+            </w:r>
+          </w:p>
+        </w:tc>
+        <w:tc>
+          <w:tcPr>
+            <w:tcW w:type="dxa" w:w="5616"/>
+            <w:vAlign w:val="top"/>
+            <w:tcMar>
+              <w:top w:w="80" w:type="dxa"/>
+              <w:bottom w:w="80" w:type="dxa"/>
+              <w:start w:w="120" w:type="dxa"/>
+              <w:end w:w="120" w:type="dxa"/>
+            </w:tcMar>
+          </w:tcPr>
+          <w:p>
+            <w:pPr>
+              <w:spacing w:after="40"/>
+            </w:pPr>
+            <w:r>
+              <w:t>Prior-year park factors; date-expanding umpire baseline; future-mutation tests; corrected rolling-start alignment.</w:t>
+            </w:r>
+          </w:p>
+        </w:tc>
+      </w:tr>
+      <w:tr>
+        <w:trPr/>
+        <w:tc>
+          <w:tcPr>
+            <w:tcW w:type="dxa" w:w="2088"/>
+            <w:vAlign w:val="top"/>
+            <w:tcMar>
+              <w:top w:w="80" w:type="dxa"/>
+              <w:bottom w:w="80" w:type="dxa"/>
+              <w:start w:w="120" w:type="dxa"/>
+              <w:end w:w="120" w:type="dxa"/>
+            </w:tcMar>
+          </w:tcPr>
+          <w:p>
+            <w:pPr>
+              <w:spacing w:after="40"/>
+            </w:pPr>
+            <w:r>
+              <w:t>Real-price backtest</w:t>
+            </w:r>
+          </w:p>
+        </w:tc>
+        <w:tc>
+          <w:tcPr>
+            <w:tcW w:type="dxa" w:w="1656"/>
+            <w:vAlign w:val="top"/>
+            <w:tcMar>
+              <w:top w:w="80" w:type="dxa"/>
+              <w:bottom w:w="80" w:type="dxa"/>
+              <w:start w:w="120" w:type="dxa"/>
+              <w:end w:w="120" w:type="dxa"/>
+            </w:tcMar>
+          </w:tcPr>
+          <w:p>
+            <w:pPr>
+              <w:spacing w:after="40"/>
+            </w:pPr>
+            <w:r>
+              <w:t>Implemented / evidence open</w:t>
+            </w:r>
+          </w:p>
+        </w:tc>
+        <w:tc>
+          <w:tcPr>
+            <w:tcW w:type="dxa" w:w="5616"/>
+            <w:vAlign w:val="top"/>
+            <w:tcMar>
+              <w:top w:w="80" w:type="dxa"/>
+              <w:bottom w:w="80" w:type="dxa"/>
+              <w:start w:w="120" w:type="dxa"/>
+              <w:end w:w="120" w:type="dxa"/>
+            </w:tcMar>
+          </w:tcPr>
+          <w:p>
+            <w:pPr>
+              <w:spacing w:after="40"/>
+            </w:pPr>
+            <w:r>
+              <w:t>Quoted American prices, vig, production risk rules, market coverage, maximum drawdown, and bootstrap ROI interval.</w:t>
+            </w:r>
+          </w:p>
+        </w:tc>
+      </w:tr>
+      <w:tr>
+        <w:trPr/>
+        <w:tc>
+          <w:tcPr>
+            <w:tcW w:type="dxa" w:w="2088"/>
+            <w:vAlign w:val="top"/>
+            <w:tcMar>
+              <w:top w:w="80" w:type="dxa"/>
+              <w:bottom w:w="80" w:type="dxa"/>
+              <w:start w:w="120" w:type="dxa"/>
+              <w:end w:w="120" w:type="dxa"/>
+            </w:tcMar>
+          </w:tcPr>
+          <w:p>
+            <w:pPr>
+              <w:spacing w:after="40"/>
+            </w:pPr>
+            <w:r>
+              <w:t>Automation</w:t>
+            </w:r>
+          </w:p>
+        </w:tc>
+        <w:tc>
+          <w:tcPr>
+            <w:tcW w:type="dxa" w:w="1656"/>
+            <w:vAlign w:val="top"/>
+            <w:tcMar>
+              <w:top w:w="80" w:type="dxa"/>
+              <w:bottom w:w="80" w:type="dxa"/>
+              <w:start w:w="120" w:type="dxa"/>
+              <w:end w:w="120" w:type="dxa"/>
+            </w:tcMar>
+          </w:tcPr>
+          <w:p>
+            <w:pPr>
+              <w:spacing w:after="40"/>
+            </w:pPr>
+            <w:r>
+              <w:t>Implemented</w:t>
+            </w:r>
+          </w:p>
+        </w:tc>
+        <w:tc>
+          <w:tcPr>
+            <w:tcW w:type="dxa" w:w="5616"/>
+            <w:vAlign w:val="top"/>
+            <w:tcMar>
+              <w:top w:w="80" w:type="dxa"/>
+              <w:bottom w:w="80" w:type="dxa"/>
+              <w:start w:w="120" w:type="dxa"/>
+              <w:end w:w="120" w:type="dxa"/>
+            </w:tcMar>
+          </w:tcPr>
+          <w:p>
+            <w:pPr>
+              <w:spacing w:after="40"/>
+            </w:pPr>
+            <w:r>
+              <w:t>Per-start-time clusters, immediate late-launch handling, game-specific logging, durable no-bet reasons, and non-zero failure exits.</w:t>
+            </w:r>
+          </w:p>
+        </w:tc>
+      </w:tr>
+      <w:tr>
+        <w:trPr/>
+        <w:tc>
+          <w:tcPr>
+            <w:tcW w:type="dxa" w:w="2088"/>
+            <w:vAlign w:val="top"/>
+            <w:tcMar>
+              <w:top w:w="80" w:type="dxa"/>
+              <w:bottom w:w="80" w:type="dxa"/>
+              <w:start w:w="120" w:type="dxa"/>
+              <w:end w:w="120" w:type="dxa"/>
+            </w:tcMar>
+          </w:tcPr>
+          <w:p>
+            <w:pPr>
+              <w:spacing w:after="40"/>
+            </w:pPr>
+            <w:r>
+              <w:t>Stale artifacts</w:t>
+            </w:r>
+          </w:p>
+        </w:tc>
+        <w:tc>
+          <w:tcPr>
+            <w:tcW w:type="dxa" w:w="1656"/>
+            <w:vAlign w:val="top"/>
+            <w:tcMar>
+              <w:top w:w="80" w:type="dxa"/>
+              <w:bottom w:w="80" w:type="dxa"/>
+              <w:start w:w="120" w:type="dxa"/>
+              <w:end w:w="120" w:type="dxa"/>
+            </w:tcMar>
+          </w:tcPr>
+          <w:p>
+            <w:pPr>
+              <w:spacing w:after="40"/>
+            </w:pPr>
+            <w:r>
+              <w:t>Implemented</w:t>
+            </w:r>
+          </w:p>
+        </w:tc>
+        <w:tc>
+          <w:tcPr>
+            <w:tcW w:type="dxa" w:w="5616"/>
+            <w:vAlign w:val="top"/>
+            <w:tcMar>
+              <w:top w:w="80" w:type="dxa"/>
+              <w:bottom w:w="80" w:type="dxa"/>
+              <w:start w:w="120" w:type="dxa"/>
+              <w:end w:w="120" w:type="dxa"/>
+            </w:tcMar>
+          </w:tcPr>
+          <w:p>
+            <w:pPr>
+              <w:spacing w:after="40"/>
+            </w:pPr>
+            <w:r>
+              <w:t>Fresh run ID/date/schema checks, atomic writes, immutable prediction history, and fail-before-ledger behavior.</w:t>
+            </w:r>
+          </w:p>
+        </w:tc>
+      </w:tr>
+      <w:tr>
+        <w:trPr/>
+        <w:tc>
+          <w:tcPr>
+            <w:tcW w:type="dxa" w:w="2088"/>
+            <w:vAlign w:val="top"/>
+            <w:tcMar>
+              <w:top w:w="80" w:type="dxa"/>
+              <w:bottom w:w="80" w:type="dxa"/>
+              <w:start w:w="120" w:type="dxa"/>
+              <w:end w:w="120" w:type="dxa"/>
+            </w:tcMar>
+          </w:tcPr>
+          <w:p>
+            <w:pPr>
+              <w:spacing w:after="40"/>
+            </w:pPr>
+            <w:r>
+              <w:t>Production model</w:t>
+            </w:r>
+          </w:p>
+        </w:tc>
+        <w:tc>
+          <w:tcPr>
+            <w:tcW w:type="dxa" w:w="1656"/>
+            <w:vAlign w:val="top"/>
+            <w:tcMar>
+              <w:top w:w="80" w:type="dxa"/>
+              <w:bottom w:w="80" w:type="dxa"/>
+              <w:start w:w="120" w:type="dxa"/>
+              <w:end w:w="120" w:type="dxa"/>
+            </w:tcMar>
+          </w:tcPr>
+          <w:p>
+            <w:pPr>
+              <w:spacing w:after="40"/>
+            </w:pPr>
+            <w:r>
+              <w:t>Implemented</w:t>
+            </w:r>
+          </w:p>
+        </w:tc>
+        <w:tc>
+          <w:tcPr>
+            <w:tcW w:type="dxa" w:w="5616"/>
+            <w:vAlign w:val="top"/>
+            <w:tcMar>
+              <w:top w:w="80" w:type="dxa"/>
+              <w:bottom w:w="80" w:type="dxa"/>
+              <w:start w:w="120" w:type="dxa"/>
+              <w:end w:w="120" w:type="dxa"/>
+            </w:tcMar>
+          </w:tcPr>
+          <w:p>
+            <w:pPr>
+              <w:spacing w:after="40"/>
+            </w:pPr>
+            <w:r>
+              <w:t>Frozen benchmark remains separate; completed-season production bundles are versioned and atomically published.</w:t>
+            </w:r>
+          </w:p>
+        </w:tc>
+      </w:tr>
+      <w:tr>
+        <w:trPr/>
+        <w:tc>
+          <w:tcPr>
+            <w:tcW w:type="dxa" w:w="2088"/>
+            <w:vAlign w:val="top"/>
+            <w:tcMar>
+              <w:top w:w="80" w:type="dxa"/>
+              <w:bottom w:w="80" w:type="dxa"/>
+              <w:start w:w="120" w:type="dxa"/>
+              <w:end w:w="120" w:type="dxa"/>
+            </w:tcMar>
+          </w:tcPr>
+          <w:p>
+            <w:pPr>
+              <w:spacing w:after="40"/>
+            </w:pPr>
+            <w:r>
+              <w:t>Pipeline health</w:t>
+            </w:r>
+          </w:p>
+        </w:tc>
+        <w:tc>
+          <w:tcPr>
+            <w:tcW w:type="dxa" w:w="1656"/>
+            <w:vAlign w:val="top"/>
+            <w:tcMar>
+              <w:top w:w="80" w:type="dxa"/>
+              <w:bottom w:w="80" w:type="dxa"/>
+              <w:start w:w="120" w:type="dxa"/>
+              <w:end w:w="120" w:type="dxa"/>
+            </w:tcMar>
+          </w:tcPr>
+          <w:p>
+            <w:pPr>
+              <w:spacing w:after="40"/>
+            </w:pPr>
+            <w:r>
+              <w:t>Implemented</w:t>
+            </w:r>
+          </w:p>
+        </w:tc>
+        <w:tc>
+          <w:tcPr>
+            <w:tcW w:type="dxa" w:w="5616"/>
+            <w:vAlign w:val="top"/>
+            <w:tcMar>
+              <w:top w:w="80" w:type="dxa"/>
+              <w:bottom w:w="80" w:type="dxa"/>
+              <w:start w:w="120" w:type="dxa"/>
+              <w:end w:w="120" w:type="dxa"/>
+            </w:tcMar>
+          </w:tcPr>
+          <w:p>
+            <w:pPr>
+              <w:spacing w:after="40"/>
+            </w:pPr>
+            <w:r>
+              <w:t>Collector, freshness, key, row, schema, coverage, and artifact-hash gates stop dependent stages.</w:t>
+            </w:r>
+          </w:p>
+        </w:tc>
+      </w:tr>
+      <w:tr>
+        <w:trPr/>
+        <w:tc>
+          <w:tcPr>
+            <w:tcW w:type="dxa" w:w="2088"/>
+            <w:vAlign w:val="top"/>
+            <w:tcMar>
+              <w:top w:w="80" w:type="dxa"/>
+              <w:bottom w:w="80" w:type="dxa"/>
+              <w:start w:w="120" w:type="dxa"/>
+              <w:end w:w="120" w:type="dxa"/>
+            </w:tcMar>
+          </w:tcPr>
+          <w:p>
+            <w:pPr>
+              <w:spacing w:after="40"/>
+            </w:pPr>
+            <w:r>
+              <w:t>Audit and risk</w:t>
+            </w:r>
+          </w:p>
+        </w:tc>
+        <w:tc>
+          <w:tcPr>
+            <w:tcW w:type="dxa" w:w="1656"/>
+            <w:vAlign w:val="top"/>
+            <w:tcMar>
+              <w:top w:w="80" w:type="dxa"/>
+              <w:bottom w:w="80" w:type="dxa"/>
+              <w:start w:w="120" w:type="dxa"/>
+              <w:end w:w="120" w:type="dxa"/>
+            </w:tcMar>
+          </w:tcPr>
+          <w:p>
+            <w:pPr>
+              <w:spacing w:after="40"/>
+            </w:pPr>
+            <w:r>
+              <w:t>Implemented</w:t>
+            </w:r>
+          </w:p>
+        </w:tc>
+        <w:tc>
+          <w:tcPr>
+            <w:tcW w:type="dxa" w:w="5616"/>
+            <w:vAlign w:val="top"/>
+            <w:tcMar>
+              <w:top w:w="80" w:type="dxa"/>
+              <w:bottom w:w="80" w:type="dxa"/>
+              <w:start w:w="120" w:type="dxa"/>
+              <w:end w:w="120" w:type="dxa"/>
+            </w:tcMar>
+          </w:tcPr>
+          <w:p>
+            <w:pPr>
+              <w:spacing w:after="40"/>
+            </w:pPr>
+            <w:r>
+              <w:t>game_pk lineage, book/event quote, model/data versions, pending-stake reserve, 2% bet cap, 8% daily cap, 15% open cap, lock, reconciliation, and void path.</w:t>
+            </w:r>
+          </w:p>
+        </w:tc>
+      </w:tr>
+      <w:tr>
+        <w:trPr/>
+        <w:tc>
+          <w:tcPr>
+            <w:tcW w:type="dxa" w:w="2088"/>
+            <w:vAlign w:val="top"/>
+            <w:tcMar>
+              <w:top w:w="80" w:type="dxa"/>
+              <w:bottom w:w="80" w:type="dxa"/>
+              <w:start w:w="120" w:type="dxa"/>
+              <w:end w:w="120" w:type="dxa"/>
+            </w:tcMar>
+          </w:tcPr>
+          <w:p>
+            <w:pPr>
+              <w:spacing w:after="40"/>
+            </w:pPr>
+            <w:r>
+              <w:t>Props</w:t>
+            </w:r>
+          </w:p>
+        </w:tc>
+        <w:tc>
+          <w:tcPr>
+            <w:tcW w:type="dxa" w:w="1656"/>
+            <w:vAlign w:val="top"/>
+            <w:tcMar>
+              <w:top w:w="80" w:type="dxa"/>
+              <w:bottom w:w="80" w:type="dxa"/>
+              <w:start w:w="120" w:type="dxa"/>
+              <w:end w:w="120" w:type="dxa"/>
+            </w:tcMar>
+          </w:tcPr>
+          <w:p>
+            <w:pPr>
+              <w:spacing w:after="40"/>
+            </w:pPr>
+            <w:r>
+              <w:t>Research-only guard retained</w:t>
+            </w:r>
+          </w:p>
+        </w:tc>
+        <w:tc>
+          <w:tcPr>
+            <w:tcW w:type="dxa" w:w="5616"/>
+            <w:vAlign w:val="top"/>
+            <w:tcMar>
+              <w:top w:w="80" w:type="dxa"/>
+              <w:bottom w:w="80" w:type="dxa"/>
+              <w:start w:w="120" w:type="dxa"/>
+              <w:end w:w="120" w:type="dxa"/>
+            </w:tcMar>
+          </w:tcPr>
+          <w:p>
+            <w:pPr>
+              <w:spacing w:after="40"/>
+            </w:pPr>
+            <w:r>
+              <w:t>Temporal joins and feature refresh were fixed; deployment remains blocked until timestamped prop odds, pushes, grading, scoring, and settlement exist.</w:t>
+            </w:r>
+          </w:p>
+        </w:tc>
+      </w:tr>
+    </w:tbl>
+    <w:p>
+      <w:pPr>
+        <w:pStyle w:val="Heading2"/>
+      </w:pPr>
+      <w:r>
+        <w:t>Verified results</w:t>
+      </w:r>
+    </w:p>
+    <w:p>
+      <w:pPr>
+        <w:pStyle w:val="ListBullet"/>
+      </w:pPr>
+      <w:r>
+        <w:t>Frozen benchmark: 2024 AUC 0.5826 and Brier 0.2446.</w:t>
+      </w:r>
+    </w:p>
+    <w:p>
+      <w:pPr>
+        <w:pStyle w:val="ListBullet"/>
+      </w:pPr>
+      <w:r>
+        <w:t>Frozen benchmark against real prices: 74 bets, -7.25% ROI, 21.8% maximum drawdown, 95% bootstrap interval approximately -32.4% to +19.0%.</w:t>
+      </w:r>
+    </w:p>
+    <w:p>
+      <w:pPr>
+        <w:pStyle w:val="ListBullet"/>
+      </w:pPr>
+      <w:r>
+        <w:t>Production bundle on 2026 out-of-sample games: AUC 0.5585 and Brier 0.2463.</w:t>
+      </w:r>
+    </w:p>
+    <w:p>
+      <w:pPr>
+        <w:pStyle w:val="ListBullet"/>
+      </w:pPr>
+      <w:r>
+        <w:t>Production bundle against real prices: 64 bets, +13.60% ROI, 9.3% maximum drawdown, 81.8% captured-date market coverage, 95% bootstrap interval approximately -15.0% to +41.4%.</w:t>
+      </w:r>
+    </w:p>
+    <w:p>
+      <w:pPr>
+        <w:pStyle w:val="ListBullet"/>
+      </w:pPr>
+      <w:r>
+        <w:t>Validation decision: false. The configured gate requires at least 200 real bets, at least 80% market coverage, and a positive lower confidence bound.</w:t>
+      </w:r>
+    </w:p>
+    <w:p>
+      <w:pPr>
+        <w:pStyle w:val="Heading2"/>
+      </w:pPr>
+      <w:r>
+        <w:t>Execution and quality checks</w:t>
+      </w:r>
+    </w:p>
+    <w:p>
+      <w:pPr>
+        <w:pStyle w:val="ListBullet"/>
+      </w:pPr>
+      <w:r>
+        <w:t>Feature build completed on 14,051 games; all 93 moneyline candidates passed their documented coverage thresholds.</w:t>
+      </w:r>
+    </w:p>
+    <w:p>
+      <w:pPr>
+        <w:pStyle w:val="ListBullet"/>
+      </w:pPr>
+      <w:r>
+        <w:t>Starter verification retained 23,991 of 28,074 pitcher appearances and excluded 4,083 relief or non-matching appearances without rewriting raw data.</w:t>
+      </w:r>
+    </w:p>
+    <w:p>
+      <w:pPr>
+        <w:pStyle w:val="ListBullet"/>
+      </w:pPr>
+      <w:r>
+        <w:t>Batter props built 284,976 rows with 59 of 59 candidate features; pitcher props built 28,099 rows with 39 of 43 candidates.</w:t>
+      </w:r>
+    </w:p>
+    <w:p>
+      <w:pPr>
+        <w:pStyle w:val="ListBullet"/>
+      </w:pPr>
+      <w:r>
+        <w:t>Nine temporal, matching, risk, ledger, and artifact tests passed; the complete offline smoke suite passed.</w:t>
+      </w:r>
+    </w:p>
+    <w:p>
+      <w:pPr>
+        <w:pStyle w:val="ListBullet"/>
+      </w:pPr>
+      <w:r>
+        <w:t>A live nine-game prediction run produced nine unique game and odds-event matches with full lineage. Because lineups were not posted, all nine were correctly marked ineligible and no bets were flagged.</w:t>
+      </w:r>
+    </w:p>
+    <w:p>
+      <w:pPr>
+        <w:pStyle w:val="ListBullet"/>
+      </w:pPr>
+      <w:r>
+        <w:t>R files parsed successfully and renv.lock now matches the installed baseballr, curl, rlang, httr2, and rappdirs dependency set.</w:t>
+      </w:r>
+    </w:p>
+    <w:p>
+      <w:pPr>
+        <w:pStyle w:val="Heading2"/>
+      </w:pPr>
+      <w:r>
+        <w:t>What remains before increasing stake</w:t>
+      </w:r>
+    </w:p>
+    <w:p>
+      <w:pPr>
+        <w:pStyle w:val="ListBullet"/>
+      </w:pPr>
+      <w:r>
+        <w:t>Continue shadow-mode collection until at least 200 real, production-rule bets exist and the lower ROI confidence bound is above zero.</w:t>
+      </w:r>
+    </w:p>
+    <w:p>
+      <w:pPr>
+        <w:pStyle w:val="ListBullet"/>
+      </w:pPr>
+      <w:r>
+        <w:t>Improve closing-line capture coverage and investigate the production model's modest 2026 discrimination before treating the positive ROI point estimate as durable.</w:t>
+      </w:r>
+    </w:p>
+    <w:p>
+      <w:pPr>
+        <w:pStyle w:val="ListBullet"/>
+      </w:pPr>
+      <w:r>
+        <w:t>Deploy and observe the revised Windows scheduled tasks; code paths are hardened, but machine wake/shutdown behavior still requires real-world monitoring.</w:t>
+      </w:r>
+    </w:p>
+    <w:p>
+      <w:pPr>
+        <w:pStyle w:val="ListBullet"/>
+      </w:pPr>
+      <w:r>
+        <w:t>Keep props research-only until real book-specific thresholds and prices, push/void grading, calibrated probabilities, daily decisions, and settlement are implemented.</w:t>
+      </w:r>
+    </w:p>
+    <w:p>
+      <w:pPr>
+        <w:pStyle w:val="Heading2"/>
+      </w:pPr>
+      <w:r>
+        <w:t>Branch and handoff</w:t>
+      </w:r>
+    </w:p>
+    <w:p>
+      <w:r>
+        <w:t>Implementation is isolated in worktree D:\mlb_model_v2_codex_model_audit_fixes on branch codex/model-audit-fixes. The production checkout and its pre-existing uncommitted bankroll work were not overwritten.</w:t>
+      </w:r>
+    </w:p>
     <w:sectPr>
       <w:headerReference w:type="default" r:id="rId9"/>
       <w:footerReference w:type="default" r:id="rId10"/>
       <w:pgSz w:w="12240" w:h="15840"/>
-      <w:pgMar w:top="1440" w:right="1440" w:bottom="1440" w:left="1440" w:header="708" w:footer="708" w:gutter="0"/>
+      <w:pgMar w:top="1080" w:right="1440" w:bottom="1080" w:left="1440" w:header="708" w:footer="708" w:gutter="0"/>
       <w:cols w:space="720"/>
       <w:docGrid w:linePitch="360"/>
     </w:sectPr>

</xml_diff>